<commit_message>
Updated 3 forms to v1.2.0, archived previous version
</commit_message>
<xml_diff>
--- a/docs/vendor-frtc-questions.docx
+++ b/docs/vendor-frtc-questions.docx
@@ -1,6 +1,6 @@
 
 <file path=word/document.xml><?xml version="1.0" encoding="utf-8"?>
-<w:document xmlns:wpc="http://schemas.microsoft.com/office/word/2010/wordprocessingCanvas" xmlns:cx="http://schemas.microsoft.com/office/drawing/2014/chartex" xmlns:cx1="http://schemas.microsoft.com/office/drawing/2015/9/8/chartex" xmlns:cx2="http://schemas.microsoft.com/office/drawing/2015/10/21/chartex" xmlns:cx3="http://schemas.microsoft.com/office/drawing/2016/5/9/chartex" xmlns:cx4="http://schemas.microsoft.com/office/drawing/2016/5/10/chartex" xmlns:cx5="http://schemas.microsoft.com/office/drawing/2016/5/11/chartex" xmlns:cx6="http://schemas.microsoft.com/office/drawing/2016/5/12/chartex" xmlns:cx7="http://schemas.microsoft.com/office/drawing/2016/5/13/chartex" xmlns:cx8="http://schemas.microsoft.com/office/drawing/2016/5/14/chartex" xmlns:mc="http://schemas.openxmlformats.org/markup-compatibility/2006" xmlns:aink="http://schemas.microsoft.com/office/drawing/2016/ink" xmlns:am3d="http://schemas.microsoft.com/office/drawing/2017/model3d" xmlns:o="urn:schemas-microsoft-com:office:office" xmlns:oel="http://schemas.microsoft.com/office/2019/extlst" xmlns:r="http://schemas.openxmlformats.org/officeDocument/2006/relationships" xmlns:m="http://schemas.openxmlformats.org/officeDocument/2006/math" xmlns:v="urn:schemas-microsoft-com:vml" xmlns:wp14="http://schemas.microsoft.com/office/word/2010/wordprocessingDrawing" xmlns:wp="http://schemas.openxmlformats.org/drawingml/2006/wordprocessingDrawing" xmlns:w10="urn:schemas-microsoft-com:office:word" xmlns:w="http://schemas.openxmlformats.org/wordprocessingml/2006/main" xmlns:w14="http://schemas.microsoft.com/office/word/2010/wordml" xmlns:w15="http://schemas.microsoft.com/office/word/2012/wordml" xmlns:w16cex="http://schemas.microsoft.com/office/word/2018/wordml/cex" xmlns:w16cid="http://schemas.microsoft.com/office/word/2016/wordml/cid" xmlns:w16="http://schemas.microsoft.com/office/word/2018/wordml" xmlns:w16du="http://schemas.microsoft.com/office/word/2023/wordml/word16du" xmlns:w16sdtdh="http://schemas.microsoft.com/office/word/2020/wordml/sdtdatahash" xmlns:w16se="http://schemas.microsoft.com/office/word/2015/wordml/symex" xmlns:wpg="http://schemas.microsoft.com/office/word/2010/wordprocessingGroup" xmlns:wpi="http://schemas.microsoft.com/office/word/2010/wordprocessingInk" xmlns:wne="http://schemas.microsoft.com/office/word/2006/wordml" xmlns:wps="http://schemas.microsoft.com/office/word/2010/wordprocessingShape" mc:Ignorable="w14 w15 w16se w16cid w16 w16cex w16sdtdh w16du wp14">
+<w:document xmlns:wpc="http://schemas.microsoft.com/office/word/2010/wordprocessingCanvas" xmlns:cx="http://schemas.microsoft.com/office/drawing/2014/chartex" xmlns:cx1="http://schemas.microsoft.com/office/drawing/2015/9/8/chartex" xmlns:cx2="http://schemas.microsoft.com/office/drawing/2015/10/21/chartex" xmlns:cx3="http://schemas.microsoft.com/office/drawing/2016/5/9/chartex" xmlns:cx4="http://schemas.microsoft.com/office/drawing/2016/5/10/chartex" xmlns:cx5="http://schemas.microsoft.com/office/drawing/2016/5/11/chartex" xmlns:cx6="http://schemas.microsoft.com/office/drawing/2016/5/12/chartex" xmlns:cx7="http://schemas.microsoft.com/office/drawing/2016/5/13/chartex" xmlns:cx8="http://schemas.microsoft.com/office/drawing/2016/5/14/chartex" xmlns:mc="http://schemas.openxmlformats.org/markup-compatibility/2006" xmlns:aink="http://schemas.microsoft.com/office/drawing/2016/ink" xmlns:am3d="http://schemas.microsoft.com/office/drawing/2017/model3d" xmlns:o="urn:schemas-microsoft-com:office:office" xmlns:oel="http://schemas.microsoft.com/office/2019/extlst" xmlns:r="http://schemas.openxmlformats.org/officeDocument/2006/relationships" xmlns:m="http://schemas.openxmlformats.org/officeDocument/2006/math" xmlns:v="urn:schemas-microsoft-com:vml" xmlns:wp14="http://schemas.microsoft.com/office/word/2010/wordprocessingDrawing" xmlns:wp="http://schemas.openxmlformats.org/drawingml/2006/wordprocessingDrawing" xmlns:w10="urn:schemas-microsoft-com:office:word" xmlns:w="http://schemas.openxmlformats.org/wordprocessingml/2006/main" xmlns:w14="http://schemas.microsoft.com/office/word/2010/wordml" xmlns:w15="http://schemas.microsoft.com/office/word/2012/wordml" xmlns:w16cex="http://schemas.microsoft.com/office/word/2018/wordml/cex" xmlns:w16cid="http://schemas.microsoft.com/office/word/2016/wordml/cid" xmlns:w16="http://schemas.microsoft.com/office/word/2018/wordml" xmlns:w16du="http://schemas.microsoft.com/office/word/2023/wordml/word16du" xmlns:w16sdtdh="http://schemas.microsoft.com/office/word/2020/wordml/sdtdatahash" xmlns:w16sdtfl="http://schemas.microsoft.com/office/word/2024/wordml/sdtformatlock" xmlns:w16se="http://schemas.microsoft.com/office/word/2015/wordml/symex" xmlns:wpg="http://schemas.microsoft.com/office/word/2010/wordprocessingGroup" xmlns:wpi="http://schemas.microsoft.com/office/word/2010/wordprocessingInk" xmlns:wne="http://schemas.microsoft.com/office/word/2006/wordml" xmlns:wps="http://schemas.microsoft.com/office/word/2010/wordprocessingShape" mc:Ignorable="w14 w15 w16se w16cid w16 w16cex w16sdtdh w16sdtfl w16du wp14">
   <w:body>
     <w:p>
       <w:pPr>
@@ -54,7 +54,35 @@
         <w:rPr>
           <w:rFonts w:ascii="Times New Roman" w:hAnsi="Times New Roman" w:cs="Times New Roman"/>
         </w:rPr>
-        <w:t>What smart card readers does the solution support for enrollment/registration?</w:t>
+        <w:t>What smart card readers does the solution support for</w:t>
+      </w:r>
+      <w:r>
+        <w:rPr>
+          <w:rFonts w:ascii="Times New Roman" w:hAnsi="Times New Roman" w:cs="Times New Roman"/>
+        </w:rPr>
+        <w:t xml:space="preserve"> the </w:t>
+      </w:r>
+      <w:r>
+        <w:rPr>
+          <w:rFonts w:ascii="Times New Roman" w:hAnsi="Times New Roman" w:cs="Times New Roman"/>
+          <w:i/>
+          <w:iCs/>
+        </w:rPr>
+        <w:t xml:space="preserve">time of </w:t>
+      </w:r>
+      <w:r>
+        <w:rPr>
+          <w:rFonts w:ascii="Times New Roman" w:hAnsi="Times New Roman" w:cs="Times New Roman"/>
+          <w:i/>
+          <w:iCs/>
+        </w:rPr>
+        <w:t>registration</w:t>
+      </w:r>
+      <w:r>
+        <w:rPr>
+          <w:rFonts w:ascii="Times New Roman" w:hAnsi="Times New Roman" w:cs="Times New Roman"/>
+        </w:rPr>
+        <w:t>?</w:t>
       </w:r>
     </w:p>
     <w:p>
@@ -84,7 +112,35 @@
         <w:rPr>
           <w:rFonts w:ascii="Times New Roman" w:hAnsi="Times New Roman" w:cs="Times New Roman"/>
         </w:rPr>
-        <w:t xml:space="preserve"> the solution support for enrollment/registration?</w:t>
+        <w:t xml:space="preserve"> the solution support for </w:t>
+      </w:r>
+      <w:r>
+        <w:rPr>
+          <w:rFonts w:ascii="Times New Roman" w:hAnsi="Times New Roman" w:cs="Times New Roman"/>
+        </w:rPr>
+        <w:t xml:space="preserve">the </w:t>
+      </w:r>
+      <w:r>
+        <w:rPr>
+          <w:rFonts w:ascii="Times New Roman" w:hAnsi="Times New Roman" w:cs="Times New Roman"/>
+          <w:i/>
+          <w:iCs/>
+        </w:rPr>
+        <w:t xml:space="preserve">time of </w:t>
+      </w:r>
+      <w:r>
+        <w:rPr>
+          <w:rFonts w:ascii="Times New Roman" w:hAnsi="Times New Roman" w:cs="Times New Roman"/>
+          <w:i/>
+          <w:iCs/>
+        </w:rPr>
+        <w:t>registration</w:t>
+      </w:r>
+      <w:r>
+        <w:rPr>
+          <w:rFonts w:ascii="Times New Roman" w:hAnsi="Times New Roman" w:cs="Times New Roman"/>
+        </w:rPr>
+        <w:t>?</w:t>
       </w:r>
     </w:p>
     <w:p>
@@ -102,7 +158,43 @@
         <w:rPr>
           <w:rFonts w:ascii="Times New Roman" w:hAnsi="Times New Roman" w:cs="Times New Roman"/>
         </w:rPr>
-        <w:t>Does the product use Microsoft Windows CAPI or something else?</w:t>
+        <w:t>Does the product u</w:t>
+      </w:r>
+      <w:r>
+        <w:rPr>
+          <w:rFonts w:ascii="Times New Roman" w:hAnsi="Times New Roman" w:cs="Times New Roman"/>
+        </w:rPr>
+        <w:t>tiliz</w:t>
+      </w:r>
+      <w:r>
+        <w:rPr>
+          <w:rFonts w:ascii="Times New Roman" w:hAnsi="Times New Roman" w:cs="Times New Roman"/>
+        </w:rPr>
+        <w:t xml:space="preserve">e Microsoft Windows CAPI or </w:t>
+      </w:r>
+      <w:r>
+        <w:rPr>
+          <w:rFonts w:ascii="Times New Roman" w:hAnsi="Times New Roman" w:cs="Times New Roman"/>
+        </w:rPr>
+        <w:t>an</w:t>
+      </w:r>
+      <w:r>
+        <w:rPr>
+          <w:rFonts w:ascii="Times New Roman" w:hAnsi="Times New Roman" w:cs="Times New Roman"/>
+        </w:rPr>
+        <w:t xml:space="preserve"> </w:t>
+      </w:r>
+      <w:r>
+        <w:rPr>
+          <w:rFonts w:ascii="Times New Roman" w:hAnsi="Times New Roman" w:cs="Times New Roman"/>
+        </w:rPr>
+        <w:t>alternativ</w:t>
+      </w:r>
+      <w:r>
+        <w:rPr>
+          <w:rFonts w:ascii="Times New Roman" w:hAnsi="Times New Roman" w:cs="Times New Roman"/>
+        </w:rPr>
+        <w:t>e?</w:t>
       </w:r>
     </w:p>
     <w:p>
@@ -194,13 +286,31 @@
         <w:rPr>
           <w:rFonts w:ascii="Times New Roman" w:hAnsi="Times New Roman" w:cs="Times New Roman"/>
         </w:rPr>
-        <w:t xml:space="preserve">do you </w:t>
-      </w:r>
-      <w:r>
-        <w:rPr>
-          <w:rFonts w:ascii="Times New Roman" w:hAnsi="Times New Roman" w:cs="Times New Roman"/>
-        </w:rPr>
-        <w:t>install certificates for use in the product for FRTC</w:t>
+        <w:t>are the certificates</w:t>
+      </w:r>
+      <w:r>
+        <w:rPr>
+          <w:rFonts w:ascii="Times New Roman" w:hAnsi="Times New Roman" w:cs="Times New Roman"/>
+        </w:rPr>
+        <w:t xml:space="preserve"> </w:t>
+      </w:r>
+      <w:r>
+        <w:rPr>
+          <w:rFonts w:ascii="Times New Roman" w:hAnsi="Times New Roman" w:cs="Times New Roman"/>
+        </w:rPr>
+        <w:t>install</w:t>
+      </w:r>
+      <w:r>
+        <w:rPr>
+          <w:rFonts w:ascii="Times New Roman" w:hAnsi="Times New Roman" w:cs="Times New Roman"/>
+        </w:rPr>
+        <w:t>ed</w:t>
+      </w:r>
+      <w:r>
+        <w:rPr>
+          <w:rFonts w:ascii="Times New Roman" w:hAnsi="Times New Roman" w:cs="Times New Roman"/>
+        </w:rPr>
+        <w:t xml:space="preserve"> for use in the product for FRTC</w:t>
       </w:r>
       <w:r>
         <w:rPr>
@@ -224,7 +334,19 @@
         <w:rPr>
           <w:rFonts w:ascii="Times New Roman" w:hAnsi="Times New Roman" w:cs="Times New Roman"/>
         </w:rPr>
-        <w:t>Where are the OIDs registered/changed within the product?</w:t>
+        <w:t>Where are the OIDs registered</w:t>
+      </w:r>
+      <w:r>
+        <w:rPr>
+          <w:rFonts w:ascii="Times New Roman" w:hAnsi="Times New Roman" w:cs="Times New Roman"/>
+        </w:rPr>
+        <w:t xml:space="preserve"> or </w:t>
+      </w:r>
+      <w:r>
+        <w:rPr>
+          <w:rFonts w:ascii="Times New Roman" w:hAnsi="Times New Roman" w:cs="Times New Roman"/>
+        </w:rPr>
+        <w:t>changed within the product?</w:t>
       </w:r>
     </w:p>
     <w:p>
@@ -242,7 +364,23 @@
         <w:rPr>
           <w:rFonts w:ascii="Times New Roman" w:hAnsi="Times New Roman" w:cs="Times New Roman"/>
         </w:rPr>
-        <w:t>Where are the logs that show the registration</w:t>
+        <w:t xml:space="preserve">Where are the logs that show the </w:t>
+      </w:r>
+      <w:r>
+        <w:rPr>
+          <w:rFonts w:ascii="Times New Roman" w:hAnsi="Times New Roman" w:cs="Times New Roman"/>
+          <w:i/>
+          <w:iCs/>
+        </w:rPr>
+        <w:t xml:space="preserve">time of </w:t>
+      </w:r>
+      <w:r>
+        <w:rPr>
+          <w:rFonts w:ascii="Times New Roman" w:hAnsi="Times New Roman" w:cs="Times New Roman"/>
+          <w:i/>
+          <w:iCs/>
+        </w:rPr>
+        <w:t>registration</w:t>
       </w:r>
       <w:r>
         <w:rPr>
@@ -272,7 +410,15 @@
         <w:rPr>
           <w:rFonts w:ascii="Times New Roman" w:hAnsi="Times New Roman" w:cs="Times New Roman"/>
         </w:rPr>
-        <w:t>Where are the logs that show the time of access</w:t>
+        <w:t xml:space="preserve">Where are the logs that show the </w:t>
+      </w:r>
+      <w:r>
+        <w:rPr>
+          <w:rFonts w:ascii="Times New Roman" w:hAnsi="Times New Roman" w:cs="Times New Roman"/>
+          <w:i/>
+          <w:iCs/>
+        </w:rPr>
+        <w:t>time of access</w:t>
       </w:r>
       <w:r>
         <w:rPr>
@@ -314,7 +460,41 @@
         <w:rPr>
           <w:rFonts w:ascii="Times New Roman" w:hAnsi="Times New Roman" w:cs="Times New Roman"/>
         </w:rPr>
-        <w:t>disable certificate validation for registration?</w:t>
+        <w:t>turn off</w:t>
+      </w:r>
+      <w:r>
+        <w:rPr>
+          <w:rFonts w:ascii="Times New Roman" w:hAnsi="Times New Roman" w:cs="Times New Roman"/>
+        </w:rPr>
+        <w:t xml:space="preserve"> certificate validation for </w:t>
+      </w:r>
+      <w:r>
+        <w:rPr>
+          <w:rFonts w:ascii="Times New Roman" w:hAnsi="Times New Roman" w:cs="Times New Roman"/>
+        </w:rPr>
+        <w:t xml:space="preserve">the </w:t>
+      </w:r>
+      <w:r>
+        <w:rPr>
+          <w:rFonts w:ascii="Times New Roman" w:hAnsi="Times New Roman" w:cs="Times New Roman"/>
+          <w:i/>
+          <w:iCs/>
+        </w:rPr>
+        <w:t xml:space="preserve">time of </w:t>
+      </w:r>
+      <w:r>
+        <w:rPr>
+          <w:rFonts w:ascii="Times New Roman" w:hAnsi="Times New Roman" w:cs="Times New Roman"/>
+          <w:i/>
+          <w:iCs/>
+        </w:rPr>
+        <w:t>registration</w:t>
+      </w:r>
+      <w:r>
+        <w:rPr>
+          <w:rFonts w:ascii="Times New Roman" w:hAnsi="Times New Roman" w:cs="Times New Roman"/>
+        </w:rPr>
+        <w:t>?</w:t>
       </w:r>
     </w:p>
     <w:p>
@@ -344,7 +524,53 @@
         <w:rPr>
           <w:rFonts w:ascii="Times New Roman" w:hAnsi="Times New Roman" w:cs="Times New Roman"/>
         </w:rPr>
-        <w:t>disable certificate validation for the time of access?</w:t>
+        <w:t>turn off</w:t>
+      </w:r>
+      <w:r>
+        <w:rPr>
+          <w:rFonts w:ascii="Times New Roman" w:hAnsi="Times New Roman" w:cs="Times New Roman"/>
+        </w:rPr>
+        <w:t xml:space="preserve"> certificate validation for the </w:t>
+      </w:r>
+      <w:r>
+        <w:rPr>
+          <w:rFonts w:ascii="Times New Roman" w:hAnsi="Times New Roman" w:cs="Times New Roman"/>
+        </w:rPr>
+        <w:t>duration</w:t>
+      </w:r>
+      <w:r>
+        <w:rPr>
+          <w:rFonts w:ascii="Times New Roman" w:hAnsi="Times New Roman" w:cs="Times New Roman"/>
+        </w:rPr>
+        <w:t xml:space="preserve"> of </w:t>
+      </w:r>
+      <w:r>
+        <w:rPr>
+          <w:rFonts w:ascii="Times New Roman" w:hAnsi="Times New Roman" w:cs="Times New Roman"/>
+        </w:rPr>
+        <w:t xml:space="preserve">the </w:t>
+      </w:r>
+      <w:r>
+        <w:rPr>
+          <w:rFonts w:ascii="Times New Roman" w:hAnsi="Times New Roman" w:cs="Times New Roman"/>
+          <w:i/>
+          <w:iCs/>
+        </w:rPr>
+        <w:t xml:space="preserve">time of </w:t>
+      </w:r>
+      <w:r>
+        <w:rPr>
+          <w:rFonts w:ascii="Times New Roman" w:hAnsi="Times New Roman" w:cs="Times New Roman"/>
+          <w:i/>
+          <w:iCs/>
+        </w:rPr>
+        <w:t>access</w:t>
+      </w:r>
+      <w:r>
+        <w:rPr>
+          <w:rFonts w:ascii="Times New Roman" w:hAnsi="Times New Roman" w:cs="Times New Roman"/>
+        </w:rPr>
+        <w:t>?</w:t>
       </w:r>
     </w:p>
     <w:p>
@@ -362,7 +588,61 @@
         <w:rPr>
           <w:rFonts w:ascii="Times New Roman" w:hAnsi="Times New Roman" w:cs="Times New Roman"/>
         </w:rPr>
-        <w:t>Does your solution rely on a validation process within the PACS software to change the user status for the time of access test cases to respond as expected?</w:t>
+        <w:t xml:space="preserve">Does your solution rely on a validation process within the PACS software to </w:t>
+      </w:r>
+      <w:r>
+        <w:rPr>
+          <w:rFonts w:ascii="Times New Roman" w:hAnsi="Times New Roman" w:cs="Times New Roman"/>
+        </w:rPr>
+        <w:t>updat</w:t>
+      </w:r>
+      <w:r>
+        <w:rPr>
+          <w:rFonts w:ascii="Times New Roman" w:hAnsi="Times New Roman" w:cs="Times New Roman"/>
+        </w:rPr>
+        <w:t xml:space="preserve">e the user status </w:t>
+      </w:r>
+      <w:r>
+        <w:rPr>
+          <w:rFonts w:ascii="Times New Roman" w:hAnsi="Times New Roman" w:cs="Times New Roman"/>
+        </w:rPr>
+        <w:t>during</w:t>
+      </w:r>
+      <w:r>
+        <w:rPr>
+          <w:rFonts w:ascii="Times New Roman" w:hAnsi="Times New Roman" w:cs="Times New Roman"/>
+        </w:rPr>
+        <w:t xml:space="preserve"> access test cases</w:t>
+      </w:r>
+      <w:r>
+        <w:rPr>
+          <w:rFonts w:ascii="Times New Roman" w:hAnsi="Times New Roman" w:cs="Times New Roman"/>
+        </w:rPr>
+        <w:t>,</w:t>
+      </w:r>
+      <w:r>
+        <w:rPr>
+          <w:rFonts w:ascii="Times New Roman" w:hAnsi="Times New Roman" w:cs="Times New Roman"/>
+        </w:rPr>
+        <w:t xml:space="preserve"> </w:t>
+      </w:r>
+      <w:r>
+        <w:rPr>
+          <w:rFonts w:ascii="Times New Roman" w:hAnsi="Times New Roman" w:cs="Times New Roman"/>
+        </w:rPr>
+        <w:t>ensuring</w:t>
+      </w:r>
+      <w:r>
+        <w:rPr>
+          <w:rFonts w:ascii="Times New Roman" w:hAnsi="Times New Roman" w:cs="Times New Roman"/>
+        </w:rPr>
+        <w:t xml:space="preserve"> they </w:t>
+      </w:r>
+      <w:r>
+        <w:rPr>
+          <w:rFonts w:ascii="Times New Roman" w:hAnsi="Times New Roman" w:cs="Times New Roman"/>
+        </w:rPr>
+        <w:t>respond as expected?</w:t>
       </w:r>
     </w:p>
     <w:p>
@@ -386,7 +666,21 @@
         <w:rPr>
           <w:rFonts w:ascii="Times New Roman" w:hAnsi="Times New Roman" w:cs="Times New Roman"/>
         </w:rPr>
-        <w:t>, specifically SW and FW versions</w:t>
+        <w:t xml:space="preserve">, specifically </w:t>
+      </w:r>
+      <w:r>
+        <w:rPr>
+          <w:rFonts w:ascii="Times New Roman" w:hAnsi="Times New Roman" w:cs="Times New Roman"/>
+          <w:kern w:val="0"/>
+          <w14:ligatures w14:val="none"/>
+        </w:rPr>
+        <w:t>the software (SW) and firmware (FW)</w:t>
+      </w:r>
+      <w:r>
+        <w:rPr>
+          <w:rFonts w:ascii="Times New Roman" w:hAnsi="Times New Roman" w:cs="Times New Roman"/>
+        </w:rPr>
+        <w:t xml:space="preserve"> versions</w:t>
       </w:r>
       <w:r>
         <w:rPr>
@@ -416,7 +710,13 @@
         <w:rPr>
           <w:rFonts w:ascii="Times New Roman" w:hAnsi="Times New Roman" w:cs="Times New Roman"/>
         </w:rPr>
-        <w:t xml:space="preserve">do you </w:t>
+        <w:t>to</w:t>
+      </w:r>
+      <w:r>
+        <w:rPr>
+          <w:rFonts w:ascii="Times New Roman" w:hAnsi="Times New Roman" w:cs="Times New Roman"/>
+        </w:rPr>
+        <w:t xml:space="preserve"> </w:t>
       </w:r>
       <w:r>
         <w:rPr>
@@ -562,7 +862,7 @@
         <w:rPr>
           <w:rFonts w:ascii="Times New Roman" w:hAnsi="Times New Roman" w:cs="Times New Roman"/>
         </w:rPr>
-        <w:t>using</w:t>
+        <w:t>the use of</w:t>
       </w:r>
       <w:r>
         <w:rPr>
@@ -604,13 +904,25 @@
         <w:rPr>
           <w:rFonts w:ascii="Times New Roman" w:hAnsi="Times New Roman" w:cs="Times New Roman"/>
         </w:rPr>
-        <w:t>using</w:t>
-      </w:r>
-      <w:r>
-        <w:rPr>
-          <w:rFonts w:ascii="Times New Roman" w:hAnsi="Times New Roman" w:cs="Times New Roman"/>
-        </w:rPr>
-        <w:t xml:space="preserve"> 128-bit UUID for Time of Registration and Time of Access?</w:t>
+        <w:t>the use of</w:t>
+      </w:r>
+      <w:r>
+        <w:rPr>
+          <w:rFonts w:ascii="Times New Roman" w:hAnsi="Times New Roman" w:cs="Times New Roman"/>
+        </w:rPr>
+        <w:t xml:space="preserve"> </w:t>
+      </w:r>
+      <w:r>
+        <w:rPr>
+          <w:rFonts w:ascii="Times New Roman" w:hAnsi="Times New Roman" w:cs="Times New Roman"/>
+        </w:rPr>
+        <w:t xml:space="preserve">a </w:t>
+      </w:r>
+      <w:r>
+        <w:rPr>
+          <w:rFonts w:ascii="Times New Roman" w:hAnsi="Times New Roman" w:cs="Times New Roman"/>
+        </w:rPr>
+        <w:t>128-bit UUID for Time of Registration and Time of Access?</w:t>
       </w:r>
     </w:p>
     <w:p>
@@ -628,67 +940,7 @@
         <w:rPr>
           <w:rFonts w:ascii="Times New Roman" w:hAnsi="Times New Roman" w:cs="Times New Roman"/>
         </w:rPr>
-        <w:t>Does the solution</w:t>
-      </w:r>
-      <w:r>
-        <w:rPr>
-          <w:rFonts w:ascii="Times New Roman" w:hAnsi="Times New Roman" w:cs="Times New Roman"/>
-        </w:rPr>
-        <w:t xml:space="preserve"> support the multifactor dynamic assignment of an individual </w:t>
-      </w:r>
-      <w:r>
-        <w:rPr>
-          <w:rFonts w:ascii="Times New Roman" w:hAnsi="Times New Roman" w:cs="Times New Roman"/>
-        </w:rPr>
-        <w:t xml:space="preserve">reader </w:t>
-      </w:r>
-      <w:r>
-        <w:rPr>
-          <w:rFonts w:ascii="Times New Roman" w:hAnsi="Times New Roman" w:cs="Times New Roman"/>
-        </w:rPr>
-        <w:t>authentication mode on a time-based schedule</w:t>
-      </w:r>
-      <w:r>
-        <w:rPr>
-          <w:rFonts w:ascii="Times New Roman" w:hAnsi="Times New Roman" w:cs="Times New Roman"/>
-        </w:rPr>
-        <w:t>?</w:t>
-      </w:r>
-      <w:r>
-        <w:rPr>
-          <w:rFonts w:ascii="Times New Roman" w:hAnsi="Times New Roman" w:cs="Times New Roman"/>
-        </w:rPr>
-        <w:t xml:space="preserve"> </w:t>
-      </w:r>
-      <w:r>
-        <w:rPr>
-          <w:rFonts w:ascii="Times New Roman" w:hAnsi="Times New Roman" w:cs="Times New Roman"/>
-          <w:i/>
-          <w:iCs/>
-        </w:rPr>
-        <w:t>(</w:t>
-      </w:r>
-      <w:r>
-        <w:rPr>
-          <w:rFonts w:ascii="Times New Roman" w:hAnsi="Times New Roman" w:cs="Times New Roman"/>
-          <w:i/>
-          <w:iCs/>
-        </w:rPr>
-        <w:t xml:space="preserve">FRTC Test Cases </w:t>
-      </w:r>
-      <w:r>
-        <w:rPr>
-          <w:rFonts w:ascii="Times New Roman" w:hAnsi="Times New Roman" w:cs="Times New Roman"/>
-          <w:i/>
-          <w:iCs/>
-        </w:rPr>
-        <w:t>7.07.05 &amp; 7.07.06)</w:t>
-      </w:r>
-      <w:r>
-        <w:rPr>
-          <w:rFonts w:ascii="Times New Roman" w:hAnsi="Times New Roman" w:cs="Times New Roman"/>
-        </w:rPr>
-        <w:t xml:space="preserve"> If yes, how is it configured?</w:t>
+        <w:t>How do I determine what the PACS system uses as the primary identifier?</w:t>
       </w:r>
     </w:p>
     <w:p>
@@ -706,7 +958,37 @@
         <w:rPr>
           <w:rFonts w:ascii="Times New Roman" w:hAnsi="Times New Roman" w:cs="Times New Roman"/>
         </w:rPr>
-        <w:t xml:space="preserve">The vendor shall provide a test data report documenting conformance for review and approval of contact readers shall support ISO/IEC 7816 </w:t>
+        <w:t>Does the solution</w:t>
+      </w:r>
+      <w:r>
+        <w:rPr>
+          <w:rFonts w:ascii="Times New Roman" w:hAnsi="Times New Roman" w:cs="Times New Roman"/>
+        </w:rPr>
+        <w:t xml:space="preserve"> support the multifactor dynamic assignment of an individual </w:t>
+      </w:r>
+      <w:r>
+        <w:rPr>
+          <w:rFonts w:ascii="Times New Roman" w:hAnsi="Times New Roman" w:cs="Times New Roman"/>
+        </w:rPr>
+        <w:t xml:space="preserve">reader </w:t>
+      </w:r>
+      <w:r>
+        <w:rPr>
+          <w:rFonts w:ascii="Times New Roman" w:hAnsi="Times New Roman" w:cs="Times New Roman"/>
+        </w:rPr>
+        <w:t>authentication mode on a time-based schedule</w:t>
+      </w:r>
+      <w:r>
+        <w:rPr>
+          <w:rFonts w:ascii="Times New Roman" w:hAnsi="Times New Roman" w:cs="Times New Roman"/>
+        </w:rPr>
+        <w:t>?</w:t>
+      </w:r>
+      <w:r>
+        <w:rPr>
+          <w:rFonts w:ascii="Times New Roman" w:hAnsi="Times New Roman" w:cs="Times New Roman"/>
+        </w:rPr>
+        <w:t xml:space="preserve"> </w:t>
       </w:r>
       <w:r>
         <w:rPr>
@@ -722,15 +1004,21 @@
           <w:i/>
           <w:iCs/>
         </w:rPr>
-        <w:t xml:space="preserve">FRTC Test Case </w:t>
-      </w:r>
-      <w:r>
-        <w:rPr>
-          <w:rFonts w:ascii="Times New Roman" w:hAnsi="Times New Roman" w:cs="Times New Roman"/>
-          <w:i/>
-          <w:iCs/>
-        </w:rPr>
-        <w:t>7.07.09)</w:t>
+        <w:t xml:space="preserve">FRTC Test Cases </w:t>
+      </w:r>
+      <w:r>
+        <w:rPr>
+          <w:rFonts w:ascii="Times New Roman" w:hAnsi="Times New Roman" w:cs="Times New Roman"/>
+          <w:i/>
+          <w:iCs/>
+        </w:rPr>
+        <w:t>7.07.05 &amp; 7.07.06)</w:t>
+      </w:r>
+      <w:r>
+        <w:rPr>
+          <w:rFonts w:ascii="Times New Roman" w:hAnsi="Times New Roman" w:cs="Times New Roman"/>
+        </w:rPr>
+        <w:t xml:space="preserve"> If yes, how is it configured?</w:t>
       </w:r>
     </w:p>
     <w:p>
@@ -742,15 +1030,31 @@
         </w:numPr>
         <w:rPr>
           <w:rFonts w:ascii="Times New Roman" w:hAnsi="Times New Roman" w:cs="Times New Roman"/>
-          <w:i/>
-          <w:iCs/>
-        </w:rPr>
-      </w:pPr>
-      <w:r>
-        <w:rPr>
-          <w:rFonts w:ascii="Times New Roman" w:hAnsi="Times New Roman" w:cs="Times New Roman"/>
-        </w:rPr>
-        <w:t xml:space="preserve">The vendor shall provide a test data report documenting conformance for review, and approval of contactless readers shall support ISO/IEC 14443 Type A </w:t>
+        </w:rPr>
+      </w:pPr>
+      <w:r>
+        <w:rPr>
+          <w:rFonts w:ascii="Times New Roman" w:hAnsi="Times New Roman" w:cs="Times New Roman"/>
+        </w:rPr>
+        <w:t>For new contact PACS readers, t</w:t>
+      </w:r>
+      <w:r>
+        <w:rPr>
+          <w:rFonts w:ascii="Times New Roman" w:hAnsi="Times New Roman" w:cs="Times New Roman"/>
+        </w:rPr>
+        <w:t>he vendor shall provide a test data report documenting conformance for review and approval of contact readers</w:t>
+      </w:r>
+      <w:r>
+        <w:rPr>
+          <w:rFonts w:ascii="Times New Roman" w:hAnsi="Times New Roman" w:cs="Times New Roman"/>
+        </w:rPr>
+        <w:t>, which</w:t>
+      </w:r>
+      <w:r>
+        <w:rPr>
+          <w:rFonts w:ascii="Times New Roman" w:hAnsi="Times New Roman" w:cs="Times New Roman"/>
+        </w:rPr>
+        <w:t xml:space="preserve"> shall support ISO/IEC 7816 </w:t>
       </w:r>
       <w:r>
         <w:rPr>
@@ -774,7 +1078,7 @@
           <w:i/>
           <w:iCs/>
         </w:rPr>
-        <w:t>7.07.10)</w:t>
+        <w:t>7.07.09)</w:t>
       </w:r>
     </w:p>
     <w:p>
@@ -786,99 +1090,45 @@
         </w:numPr>
         <w:rPr>
           <w:rFonts w:ascii="Times New Roman" w:hAnsi="Times New Roman" w:cs="Times New Roman"/>
-        </w:rPr>
-      </w:pPr>
-      <w:r>
-        <w:rPr>
-          <w:rFonts w:ascii="Times New Roman" w:hAnsi="Times New Roman" w:cs="Times New Roman"/>
-        </w:rPr>
-        <w:t xml:space="preserve">The vendor shall </w:t>
-      </w:r>
-      <w:r>
-        <w:rPr>
-          <w:rFonts w:ascii="Times New Roman" w:hAnsi="Times New Roman" w:cs="Times New Roman"/>
-        </w:rPr>
-        <w:t xml:space="preserve">confirm the </w:t>
-      </w:r>
-      <w:r>
-        <w:rPr>
-          <w:rFonts w:ascii="Times New Roman" w:hAnsi="Times New Roman" w:cs="Times New Roman"/>
-        </w:rPr>
-        <w:t xml:space="preserve">item doing the crypto at </w:t>
-      </w:r>
-      <w:r>
-        <w:rPr>
-          <w:rFonts w:ascii="Times New Roman" w:hAnsi="Times New Roman" w:cs="Times New Roman"/>
-        </w:rPr>
-        <w:t xml:space="preserve">the </w:t>
-      </w:r>
-      <w:r>
-        <w:rPr>
-          <w:rFonts w:ascii="Times New Roman" w:hAnsi="Times New Roman" w:cs="Times New Roman"/>
-        </w:rPr>
-        <w:t xml:space="preserve">Time of Access </w:t>
-      </w:r>
-      <w:r>
-        <w:rPr>
-          <w:rFonts w:ascii="Times New Roman" w:hAnsi="Times New Roman" w:cs="Times New Roman"/>
-        </w:rPr>
-        <w:t>(Reader</w:t>
-      </w:r>
-      <w:r>
-        <w:rPr>
-          <w:rFonts w:ascii="Times New Roman" w:hAnsi="Times New Roman" w:cs="Times New Roman"/>
-        </w:rPr>
-        <w:t xml:space="preserve"> or Controller)</w:t>
-      </w:r>
-      <w:r>
-        <w:rPr>
-          <w:rFonts w:ascii="Times New Roman" w:hAnsi="Times New Roman" w:cs="Times New Roman"/>
-        </w:rPr>
-        <w:t xml:space="preserve"> and </w:t>
-      </w:r>
-      <w:r>
-        <w:rPr>
-          <w:rFonts w:ascii="Times New Roman" w:hAnsi="Times New Roman" w:cs="Times New Roman"/>
-        </w:rPr>
-        <w:t xml:space="preserve">provide </w:t>
-      </w:r>
-      <w:r>
-        <w:rPr>
-          <w:rFonts w:ascii="Times New Roman" w:hAnsi="Times New Roman" w:cs="Times New Roman"/>
-        </w:rPr>
-        <w:t xml:space="preserve">the </w:t>
-      </w:r>
-      <w:r>
-        <w:rPr>
-          <w:rFonts w:ascii="Times New Roman" w:hAnsi="Times New Roman" w:cs="Times New Roman"/>
-        </w:rPr>
-        <w:t xml:space="preserve">CMVP certificate number for the </w:t>
-      </w:r>
-      <w:r>
-        <w:rPr>
-          <w:rFonts w:ascii="Times New Roman" w:hAnsi="Times New Roman" w:cs="Times New Roman"/>
-        </w:rPr>
-        <w:t>item</w:t>
-      </w:r>
-      <w:r>
-        <w:rPr>
-          <w:rFonts w:ascii="Times New Roman" w:hAnsi="Times New Roman" w:cs="Times New Roman"/>
-        </w:rPr>
-        <w:t xml:space="preserve"> as required in the </w:t>
-      </w:r>
-      <w:r>
-        <w:rPr>
-          <w:rFonts w:ascii="Times New Roman" w:hAnsi="Times New Roman" w:cs="Times New Roman"/>
-          <w:i/>
-          <w:iCs/>
-        </w:rPr>
-        <w:t>FRTC test case 7.09.05</w:t>
-      </w:r>
-      <w:r>
-        <w:rPr>
-          <w:rFonts w:ascii="Times New Roman" w:hAnsi="Times New Roman" w:cs="Times New Roman"/>
-        </w:rPr>
-        <w:t>.</w:t>
+          <w:i/>
+          <w:iCs/>
+        </w:rPr>
+      </w:pPr>
+      <w:r>
+        <w:rPr>
+          <w:rFonts w:ascii="Times New Roman" w:hAnsi="Times New Roman" w:cs="Times New Roman"/>
+        </w:rPr>
+        <w:t>For new contactless PACS readers, t</w:t>
+      </w:r>
+      <w:r>
+        <w:rPr>
+          <w:rFonts w:ascii="Times New Roman" w:hAnsi="Times New Roman" w:cs="Times New Roman"/>
+        </w:rPr>
+        <w:t xml:space="preserve">he vendor shall provide a test data report documenting conformance for review, and approval of contactless readers shall support ISO/IEC 14443 Type A </w:t>
+      </w:r>
+      <w:r>
+        <w:rPr>
+          <w:rFonts w:ascii="Times New Roman" w:hAnsi="Times New Roman" w:cs="Times New Roman"/>
+          <w:i/>
+          <w:iCs/>
+        </w:rPr>
+        <w:t>(</w:t>
+      </w:r>
+      <w:r>
+        <w:rPr>
+          <w:rFonts w:ascii="Times New Roman" w:hAnsi="Times New Roman" w:cs="Times New Roman"/>
+          <w:i/>
+          <w:iCs/>
+        </w:rPr>
+        <w:t xml:space="preserve">FRTC Test Case </w:t>
+      </w:r>
+      <w:r>
+        <w:rPr>
+          <w:rFonts w:ascii="Times New Roman" w:hAnsi="Times New Roman" w:cs="Times New Roman"/>
+          <w:i/>
+          <w:iCs/>
+        </w:rPr>
+        <w:t>7.07.10)</w:t>
       </w:r>
     </w:p>
     <w:p>
@@ -896,7 +1146,81 @@
         <w:rPr>
           <w:rFonts w:ascii="Times New Roman" w:hAnsi="Times New Roman" w:cs="Times New Roman"/>
         </w:rPr>
-        <w:t xml:space="preserve"> How do I determine what the PACS system uses as the primary identifier?</w:t>
+        <w:t xml:space="preserve">The vendor shall </w:t>
+      </w:r>
+      <w:r>
+        <w:rPr>
+          <w:rFonts w:ascii="Times New Roman" w:hAnsi="Times New Roman" w:cs="Times New Roman"/>
+        </w:rPr>
+        <w:t xml:space="preserve">confirm the </w:t>
+      </w:r>
+      <w:r>
+        <w:rPr>
+          <w:rFonts w:ascii="Times New Roman" w:hAnsi="Times New Roman" w:cs="Times New Roman"/>
+        </w:rPr>
+        <w:t xml:space="preserve">item doing the crypto at </w:t>
+      </w:r>
+      <w:r>
+        <w:rPr>
+          <w:rFonts w:ascii="Times New Roman" w:hAnsi="Times New Roman" w:cs="Times New Roman"/>
+        </w:rPr>
+        <w:t xml:space="preserve">the </w:t>
+      </w:r>
+      <w:r>
+        <w:rPr>
+          <w:rFonts w:ascii="Times New Roman" w:hAnsi="Times New Roman" w:cs="Times New Roman"/>
+        </w:rPr>
+        <w:t>Time of Access (Reader or Controller)</w:t>
+      </w:r>
+      <w:r>
+        <w:rPr>
+          <w:rFonts w:ascii="Times New Roman" w:hAnsi="Times New Roman" w:cs="Times New Roman"/>
+        </w:rPr>
+        <w:t xml:space="preserve"> and </w:t>
+      </w:r>
+      <w:r>
+        <w:rPr>
+          <w:rFonts w:ascii="Times New Roman" w:hAnsi="Times New Roman" w:cs="Times New Roman"/>
+        </w:rPr>
+        <w:t xml:space="preserve">provide </w:t>
+      </w:r>
+      <w:r>
+        <w:rPr>
+          <w:rFonts w:ascii="Times New Roman" w:hAnsi="Times New Roman" w:cs="Times New Roman"/>
+        </w:rPr>
+        <w:t xml:space="preserve">the </w:t>
+      </w:r>
+      <w:r>
+        <w:rPr>
+          <w:rFonts w:ascii="Times New Roman" w:hAnsi="Times New Roman" w:cs="Times New Roman"/>
+        </w:rPr>
+        <w:t xml:space="preserve">CMVP certificate number for the </w:t>
+      </w:r>
+      <w:r>
+        <w:rPr>
+          <w:rFonts w:ascii="Times New Roman" w:hAnsi="Times New Roman" w:cs="Times New Roman"/>
+        </w:rPr>
+        <w:t>item</w:t>
+      </w:r>
+      <w:r>
+        <w:rPr>
+          <w:rFonts w:ascii="Times New Roman" w:hAnsi="Times New Roman" w:cs="Times New Roman"/>
+        </w:rPr>
+        <w:t xml:space="preserve"> as required in the </w:t>
+      </w:r>
+      <w:r>
+        <w:rPr>
+          <w:rFonts w:ascii="Times New Roman" w:hAnsi="Times New Roman" w:cs="Times New Roman"/>
+          <w:i/>
+          <w:iCs/>
+        </w:rPr>
+        <w:t>FRTC test case 7.09.05</w:t>
+      </w:r>
+      <w:r>
+        <w:rPr>
+          <w:rFonts w:ascii="Times New Roman" w:hAnsi="Times New Roman" w:cs="Times New Roman"/>
+        </w:rPr>
+        <w:t>.</w:t>
       </w:r>
     </w:p>
     <w:p>
@@ -914,19 +1238,37 @@
         <w:rPr>
           <w:rFonts w:ascii="Times New Roman" w:hAnsi="Times New Roman" w:cs="Times New Roman"/>
         </w:rPr>
-        <w:t xml:space="preserve"> Does the solution leverage a cached copy of the public key extracted at the time of</w:t>
-      </w:r>
-      <w:r>
-        <w:rPr>
-          <w:rFonts w:ascii="Times New Roman" w:hAnsi="Times New Roman" w:cs="Times New Roman"/>
+        <w:t xml:space="preserve"> Does the solution leverage a cached copy of the public key extracted at the </w:t>
+      </w:r>
+      <w:r>
+        <w:rPr>
+          <w:rFonts w:ascii="Times New Roman" w:hAnsi="Times New Roman" w:cs="Times New Roman"/>
+          <w:i/>
+          <w:iCs/>
+        </w:rPr>
+        <w:t>time of</w:t>
+      </w:r>
+      <w:r>
+        <w:rPr>
+          <w:rFonts w:ascii="Times New Roman" w:hAnsi="Times New Roman" w:cs="Times New Roman"/>
+          <w:i/>
+          <w:iCs/>
         </w:rPr>
         <w:t xml:space="preserve"> </w:t>
       </w:r>
       <w:r>
         <w:rPr>
           <w:rFonts w:ascii="Times New Roman" w:hAnsi="Times New Roman" w:cs="Times New Roman"/>
-        </w:rPr>
-        <w:t>registration for</w:t>
+          <w:i/>
+          <w:iCs/>
+        </w:rPr>
+        <w:t>registration</w:t>
+      </w:r>
+      <w:r>
+        <w:rPr>
+          <w:rFonts w:ascii="Times New Roman" w:hAnsi="Times New Roman" w:cs="Times New Roman"/>
+        </w:rPr>
+        <w:t xml:space="preserve"> for</w:t>
       </w:r>
       <w:r>
         <w:rPr>
@@ -938,7 +1280,45 @@
         <w:rPr>
           <w:rFonts w:ascii="Times New Roman" w:hAnsi="Times New Roman" w:cs="Times New Roman"/>
         </w:rPr>
-        <w:t>signature verification at the Time of Access? (5.02.06)</w:t>
+        <w:t xml:space="preserve">signature verification at the </w:t>
+      </w:r>
+      <w:r>
+        <w:rPr>
+          <w:rFonts w:ascii="Times New Roman" w:hAnsi="Times New Roman" w:cs="Times New Roman"/>
+          <w:i/>
+          <w:iCs/>
+        </w:rPr>
+        <w:t>t</w:t>
+      </w:r>
+      <w:r>
+        <w:rPr>
+          <w:rFonts w:ascii="Times New Roman" w:hAnsi="Times New Roman" w:cs="Times New Roman"/>
+          <w:i/>
+          <w:iCs/>
+        </w:rPr>
+        <w:t xml:space="preserve">ime of </w:t>
+      </w:r>
+      <w:r>
+        <w:rPr>
+          <w:rFonts w:ascii="Times New Roman" w:hAnsi="Times New Roman" w:cs="Times New Roman"/>
+          <w:i/>
+          <w:iCs/>
+        </w:rPr>
+        <w:t>a</w:t>
+      </w:r>
+      <w:r>
+        <w:rPr>
+          <w:rFonts w:ascii="Times New Roman" w:hAnsi="Times New Roman" w:cs="Times New Roman"/>
+          <w:i/>
+          <w:iCs/>
+        </w:rPr>
+        <w:t>ccess</w:t>
+      </w:r>
+      <w:r>
+        <w:rPr>
+          <w:rFonts w:ascii="Times New Roman" w:hAnsi="Times New Roman" w:cs="Times New Roman"/>
+        </w:rPr>
+        <w:t>? (5.02.06)</w:t>
       </w:r>
       <w:r>
         <w:rPr>
@@ -998,7 +1378,31 @@
         <w:rPr>
           <w:rFonts w:ascii="Times New Roman" w:hAnsi="Times New Roman" w:cs="Times New Roman"/>
         </w:rPr>
-        <w:t>How do you turn on fingerprint verification required for enrollment/registration?</w:t>
+        <w:t xml:space="preserve">How do you </w:t>
+      </w:r>
+      <w:r>
+        <w:rPr>
+          <w:rFonts w:ascii="Times New Roman" w:hAnsi="Times New Roman" w:cs="Times New Roman"/>
+        </w:rPr>
+        <w:t>enable</w:t>
+      </w:r>
+      <w:r>
+        <w:rPr>
+          <w:rFonts w:ascii="Times New Roman" w:hAnsi="Times New Roman" w:cs="Times New Roman"/>
+        </w:rPr>
+        <w:t xml:space="preserve"> fingerprint verification for enrollment</w:t>
+      </w:r>
+      <w:r>
+        <w:rPr>
+          <w:rFonts w:ascii="Times New Roman" w:hAnsi="Times New Roman" w:cs="Times New Roman"/>
+        </w:rPr>
+        <w:t xml:space="preserve"> or </w:t>
+      </w:r>
+      <w:r>
+        <w:rPr>
+          <w:rFonts w:ascii="Times New Roman" w:hAnsi="Times New Roman" w:cs="Times New Roman"/>
+        </w:rPr>
+        <w:t>registration?</w:t>
       </w:r>
     </w:p>
     <w:p>
@@ -1016,7 +1420,32 @@
         <w:rPr>
           <w:rFonts w:ascii="Times New Roman" w:hAnsi="Times New Roman" w:cs="Times New Roman"/>
         </w:rPr>
-        <w:t>How do you turn off fingerprint verification required for enrollment/registration?</w:t>
+        <w:lastRenderedPageBreak/>
+        <w:t xml:space="preserve">How do you </w:t>
+      </w:r>
+      <w:r>
+        <w:rPr>
+          <w:rFonts w:ascii="Times New Roman" w:hAnsi="Times New Roman" w:cs="Times New Roman"/>
+        </w:rPr>
+        <w:t>turn off</w:t>
+      </w:r>
+      <w:r>
+        <w:rPr>
+          <w:rFonts w:ascii="Times New Roman" w:hAnsi="Times New Roman" w:cs="Times New Roman"/>
+        </w:rPr>
+        <w:t xml:space="preserve"> fingerprint verification for enrollment</w:t>
+      </w:r>
+      <w:r>
+        <w:rPr>
+          <w:rFonts w:ascii="Times New Roman" w:hAnsi="Times New Roman" w:cs="Times New Roman"/>
+        </w:rPr>
+        <w:t xml:space="preserve"> or </w:t>
+      </w:r>
+      <w:r>
+        <w:rPr>
+          <w:rFonts w:ascii="Times New Roman" w:hAnsi="Times New Roman" w:cs="Times New Roman"/>
+        </w:rPr>
+        <w:t>registration?</w:t>
       </w:r>
     </w:p>
     <w:p>
@@ -1039,6 +1468,8 @@
     </w:p>
     <w:sectPr>
       <w:headerReference w:type="default" r:id="rId7"/>
+      <w:footerReference w:type="even" r:id="rId8"/>
+      <w:footerReference w:type="default" r:id="rId9"/>
       <w:pgSz w:w="12240" w:h="15840"/>
       <w:pgMar w:top="1440" w:right="1440" w:bottom="1440" w:left="1440" w:header="720" w:footer="720" w:gutter="0"/>
       <w:cols w:space="720"/>
@@ -1049,7 +1480,7 @@
 </file>
 
 <file path=word/endnotes.xml><?xml version="1.0" encoding="utf-8"?>
-<w:endnotes xmlns:wpc="http://schemas.microsoft.com/office/word/2010/wordprocessingCanvas" xmlns:cx="http://schemas.microsoft.com/office/drawing/2014/chartex" xmlns:cx1="http://schemas.microsoft.com/office/drawing/2015/9/8/chartex" xmlns:cx2="http://schemas.microsoft.com/office/drawing/2015/10/21/chartex" xmlns:cx3="http://schemas.microsoft.com/office/drawing/2016/5/9/chartex" xmlns:cx4="http://schemas.microsoft.com/office/drawing/2016/5/10/chartex" xmlns:cx5="http://schemas.microsoft.com/office/drawing/2016/5/11/chartex" xmlns:cx6="http://schemas.microsoft.com/office/drawing/2016/5/12/chartex" xmlns:cx7="http://schemas.microsoft.com/office/drawing/2016/5/13/chartex" xmlns:cx8="http://schemas.microsoft.com/office/drawing/2016/5/14/chartex" xmlns:mc="http://schemas.openxmlformats.org/markup-compatibility/2006" xmlns:aink="http://schemas.microsoft.com/office/drawing/2016/ink" xmlns:am3d="http://schemas.microsoft.com/office/drawing/2017/model3d" xmlns:o="urn:schemas-microsoft-com:office:office" xmlns:oel="http://schemas.microsoft.com/office/2019/extlst" xmlns:r="http://schemas.openxmlformats.org/officeDocument/2006/relationships" xmlns:m="http://schemas.openxmlformats.org/officeDocument/2006/math" xmlns:v="urn:schemas-microsoft-com:vml" xmlns:wp14="http://schemas.microsoft.com/office/word/2010/wordprocessingDrawing" xmlns:wp="http://schemas.openxmlformats.org/drawingml/2006/wordprocessingDrawing" xmlns:w10="urn:schemas-microsoft-com:office:word" xmlns:w="http://schemas.openxmlformats.org/wordprocessingml/2006/main" xmlns:w14="http://schemas.microsoft.com/office/word/2010/wordml" xmlns:w15="http://schemas.microsoft.com/office/word/2012/wordml" xmlns:w16cex="http://schemas.microsoft.com/office/word/2018/wordml/cex" xmlns:w16cid="http://schemas.microsoft.com/office/word/2016/wordml/cid" xmlns:w16="http://schemas.microsoft.com/office/word/2018/wordml" xmlns:w16du="http://schemas.microsoft.com/office/word/2023/wordml/word16du" xmlns:w16sdtdh="http://schemas.microsoft.com/office/word/2020/wordml/sdtdatahash" xmlns:w16se="http://schemas.microsoft.com/office/word/2015/wordml/symex" xmlns:wpg="http://schemas.microsoft.com/office/word/2010/wordprocessingGroup" xmlns:wpi="http://schemas.microsoft.com/office/word/2010/wordprocessingInk" xmlns:wne="http://schemas.microsoft.com/office/word/2006/wordml" xmlns:wps="http://schemas.microsoft.com/office/word/2010/wordprocessingShape" mc:Ignorable="w14 w15 w16se w16cid w16 w16cex w16sdtdh w16du wp14">
+<w:endnotes xmlns:wpc="http://schemas.microsoft.com/office/word/2010/wordprocessingCanvas" xmlns:cx="http://schemas.microsoft.com/office/drawing/2014/chartex" xmlns:cx1="http://schemas.microsoft.com/office/drawing/2015/9/8/chartex" xmlns:cx2="http://schemas.microsoft.com/office/drawing/2015/10/21/chartex" xmlns:cx3="http://schemas.microsoft.com/office/drawing/2016/5/9/chartex" xmlns:cx4="http://schemas.microsoft.com/office/drawing/2016/5/10/chartex" xmlns:cx5="http://schemas.microsoft.com/office/drawing/2016/5/11/chartex" xmlns:cx6="http://schemas.microsoft.com/office/drawing/2016/5/12/chartex" xmlns:cx7="http://schemas.microsoft.com/office/drawing/2016/5/13/chartex" xmlns:cx8="http://schemas.microsoft.com/office/drawing/2016/5/14/chartex" xmlns:mc="http://schemas.openxmlformats.org/markup-compatibility/2006" xmlns:aink="http://schemas.microsoft.com/office/drawing/2016/ink" xmlns:am3d="http://schemas.microsoft.com/office/drawing/2017/model3d" xmlns:o="urn:schemas-microsoft-com:office:office" xmlns:oel="http://schemas.microsoft.com/office/2019/extlst" xmlns:r="http://schemas.openxmlformats.org/officeDocument/2006/relationships" xmlns:m="http://schemas.openxmlformats.org/officeDocument/2006/math" xmlns:v="urn:schemas-microsoft-com:vml" xmlns:wp14="http://schemas.microsoft.com/office/word/2010/wordprocessingDrawing" xmlns:wp="http://schemas.openxmlformats.org/drawingml/2006/wordprocessingDrawing" xmlns:w10="urn:schemas-microsoft-com:office:word" xmlns:w="http://schemas.openxmlformats.org/wordprocessingml/2006/main" xmlns:w14="http://schemas.microsoft.com/office/word/2010/wordml" xmlns:w15="http://schemas.microsoft.com/office/word/2012/wordml" xmlns:w16cex="http://schemas.microsoft.com/office/word/2018/wordml/cex" xmlns:w16cid="http://schemas.microsoft.com/office/word/2016/wordml/cid" xmlns:w16="http://schemas.microsoft.com/office/word/2018/wordml" xmlns:w16du="http://schemas.microsoft.com/office/word/2023/wordml/word16du" xmlns:w16sdtdh="http://schemas.microsoft.com/office/word/2020/wordml/sdtdatahash" xmlns:w16sdtfl="http://schemas.microsoft.com/office/word/2024/wordml/sdtformatlock" xmlns:w16se="http://schemas.microsoft.com/office/word/2015/wordml/symex" xmlns:wpg="http://schemas.microsoft.com/office/word/2010/wordprocessingGroup" xmlns:wpi="http://schemas.microsoft.com/office/word/2010/wordprocessingInk" xmlns:wne="http://schemas.microsoft.com/office/word/2006/wordml" xmlns:wps="http://schemas.microsoft.com/office/word/2010/wordprocessingShape" mc:Ignorable="w14 w15 w16se w16cid w16 w16cex w16sdtdh w16sdtfl w16du wp14">
   <w:endnote w:type="separator" w:id="-1">
     <w:p>
       <w:r>
@@ -1067,8 +1498,133 @@
 </w:endnotes>
 </file>
 
+<file path=word/footer1.xml><?xml version="1.0" encoding="utf-8"?>
+<w:ftr xmlns:wpc="http://schemas.microsoft.com/office/word/2010/wordprocessingCanvas" xmlns:cx="http://schemas.microsoft.com/office/drawing/2014/chartex" xmlns:cx1="http://schemas.microsoft.com/office/drawing/2015/9/8/chartex" xmlns:cx2="http://schemas.microsoft.com/office/drawing/2015/10/21/chartex" xmlns:cx3="http://schemas.microsoft.com/office/drawing/2016/5/9/chartex" xmlns:cx4="http://schemas.microsoft.com/office/drawing/2016/5/10/chartex" xmlns:cx5="http://schemas.microsoft.com/office/drawing/2016/5/11/chartex" xmlns:cx6="http://schemas.microsoft.com/office/drawing/2016/5/12/chartex" xmlns:cx7="http://schemas.microsoft.com/office/drawing/2016/5/13/chartex" xmlns:cx8="http://schemas.microsoft.com/office/drawing/2016/5/14/chartex" xmlns:mc="http://schemas.openxmlformats.org/markup-compatibility/2006" xmlns:aink="http://schemas.microsoft.com/office/drawing/2016/ink" xmlns:am3d="http://schemas.microsoft.com/office/drawing/2017/model3d" xmlns:o="urn:schemas-microsoft-com:office:office" xmlns:oel="http://schemas.microsoft.com/office/2019/extlst" xmlns:r="http://schemas.openxmlformats.org/officeDocument/2006/relationships" xmlns:m="http://schemas.openxmlformats.org/officeDocument/2006/math" xmlns:v="urn:schemas-microsoft-com:vml" xmlns:wp14="http://schemas.microsoft.com/office/word/2010/wordprocessingDrawing" xmlns:wp="http://schemas.openxmlformats.org/drawingml/2006/wordprocessingDrawing" xmlns:w10="urn:schemas-microsoft-com:office:word" xmlns:w="http://schemas.openxmlformats.org/wordprocessingml/2006/main" xmlns:w14="http://schemas.microsoft.com/office/word/2010/wordml" xmlns:w15="http://schemas.microsoft.com/office/word/2012/wordml" xmlns:w16cex="http://schemas.microsoft.com/office/word/2018/wordml/cex" xmlns:w16cid="http://schemas.microsoft.com/office/word/2016/wordml/cid" xmlns:w16="http://schemas.microsoft.com/office/word/2018/wordml" xmlns:w16du="http://schemas.microsoft.com/office/word/2023/wordml/word16du" xmlns:w16sdtdh="http://schemas.microsoft.com/office/word/2020/wordml/sdtdatahash" xmlns:w16sdtfl="http://schemas.microsoft.com/office/word/2024/wordml/sdtformatlock" xmlns:w16se="http://schemas.microsoft.com/office/word/2015/wordml/symex" xmlns:wpg="http://schemas.microsoft.com/office/word/2010/wordprocessingGroup" xmlns:wpi="http://schemas.microsoft.com/office/word/2010/wordprocessingInk" xmlns:wne="http://schemas.microsoft.com/office/word/2006/wordml" xmlns:wps="http://schemas.microsoft.com/office/word/2010/wordprocessingShape" mc:Ignorable="w14 w15 w16se w16cid w16 w16cex w16sdtdh w16sdtfl w16du wp14">
+  <w:sdt>
+    <w:sdtPr>
+      <w:rPr>
+        <w:rStyle w:val="PageNumber"/>
+      </w:rPr>
+      <w:id w:val="-831220245"/>
+      <w:docPartObj>
+        <w:docPartGallery w:val="Page Numbers (Bottom of Page)"/>
+        <w:docPartUnique/>
+      </w:docPartObj>
+    </w:sdtPr>
+    <w:sdtEndPr>
+      <w:rPr>
+        <w:rStyle w:val="PageNumber"/>
+      </w:rPr>
+    </w:sdtEndPr>
+    <w:sdtContent>
+      <w:p>
+        <w:pPr>
+          <w:pStyle w:val="Footer"/>
+          <w:framePr w:wrap="none" w:vAnchor="text" w:hAnchor="margin" w:xAlign="center" w:y="1"/>
+          <w:rPr>
+            <w:rStyle w:val="PageNumber"/>
+          </w:rPr>
+        </w:pPr>
+        <w:r>
+          <w:rPr>
+            <w:rStyle w:val="PageNumber"/>
+          </w:rPr>
+          <w:fldChar w:fldCharType="begin"/>
+        </w:r>
+        <w:r>
+          <w:rPr>
+            <w:rStyle w:val="PageNumber"/>
+          </w:rPr>
+          <w:instrText xml:space="preserve"> PAGE </w:instrText>
+        </w:r>
+        <w:r>
+          <w:rPr>
+            <w:rStyle w:val="PageNumber"/>
+          </w:rPr>
+          <w:fldChar w:fldCharType="end"/>
+        </w:r>
+      </w:p>
+    </w:sdtContent>
+  </w:sdt>
+  <w:p>
+    <w:pPr>
+      <w:pStyle w:val="Footer"/>
+    </w:pPr>
+  </w:p>
+</w:ftr>
+</file>
+
+<file path=word/footer2.xml><?xml version="1.0" encoding="utf-8"?>
+<w:ftr xmlns:wpc="http://schemas.microsoft.com/office/word/2010/wordprocessingCanvas" xmlns:cx="http://schemas.microsoft.com/office/drawing/2014/chartex" xmlns:cx1="http://schemas.microsoft.com/office/drawing/2015/9/8/chartex" xmlns:cx2="http://schemas.microsoft.com/office/drawing/2015/10/21/chartex" xmlns:cx3="http://schemas.microsoft.com/office/drawing/2016/5/9/chartex" xmlns:cx4="http://schemas.microsoft.com/office/drawing/2016/5/10/chartex" xmlns:cx5="http://schemas.microsoft.com/office/drawing/2016/5/11/chartex" xmlns:cx6="http://schemas.microsoft.com/office/drawing/2016/5/12/chartex" xmlns:cx7="http://schemas.microsoft.com/office/drawing/2016/5/13/chartex" xmlns:cx8="http://schemas.microsoft.com/office/drawing/2016/5/14/chartex" xmlns:mc="http://schemas.openxmlformats.org/markup-compatibility/2006" xmlns:aink="http://schemas.microsoft.com/office/drawing/2016/ink" xmlns:am3d="http://schemas.microsoft.com/office/drawing/2017/model3d" xmlns:o="urn:schemas-microsoft-com:office:office" xmlns:oel="http://schemas.microsoft.com/office/2019/extlst" xmlns:r="http://schemas.openxmlformats.org/officeDocument/2006/relationships" xmlns:m="http://schemas.openxmlformats.org/officeDocument/2006/math" xmlns:v="urn:schemas-microsoft-com:vml" xmlns:wp14="http://schemas.microsoft.com/office/word/2010/wordprocessingDrawing" xmlns:wp="http://schemas.openxmlformats.org/drawingml/2006/wordprocessingDrawing" xmlns:w10="urn:schemas-microsoft-com:office:word" xmlns:w="http://schemas.openxmlformats.org/wordprocessingml/2006/main" xmlns:w14="http://schemas.microsoft.com/office/word/2010/wordml" xmlns:w15="http://schemas.microsoft.com/office/word/2012/wordml" xmlns:w16cex="http://schemas.microsoft.com/office/word/2018/wordml/cex" xmlns:w16cid="http://schemas.microsoft.com/office/word/2016/wordml/cid" xmlns:w16="http://schemas.microsoft.com/office/word/2018/wordml" xmlns:w16du="http://schemas.microsoft.com/office/word/2023/wordml/word16du" xmlns:w16sdtdh="http://schemas.microsoft.com/office/word/2020/wordml/sdtdatahash" xmlns:w16sdtfl="http://schemas.microsoft.com/office/word/2024/wordml/sdtformatlock" xmlns:w16se="http://schemas.microsoft.com/office/word/2015/wordml/symex" xmlns:wpg="http://schemas.microsoft.com/office/word/2010/wordprocessingGroup" xmlns:wpi="http://schemas.microsoft.com/office/word/2010/wordprocessingInk" xmlns:wne="http://schemas.microsoft.com/office/word/2006/wordml" xmlns:wps="http://schemas.microsoft.com/office/word/2010/wordprocessingShape" mc:Ignorable="w14 w15 w16se w16cid w16 w16cex w16sdtdh w16sdtfl w16du wp14">
+  <w:sdt>
+    <w:sdtPr>
+      <w:rPr>
+        <w:rStyle w:val="PageNumber"/>
+      </w:rPr>
+      <w:id w:val="-468593559"/>
+      <w:docPartObj>
+        <w:docPartGallery w:val="Page Numbers (Bottom of Page)"/>
+        <w:docPartUnique/>
+      </w:docPartObj>
+    </w:sdtPr>
+    <w:sdtEndPr>
+      <w:rPr>
+        <w:rStyle w:val="PageNumber"/>
+      </w:rPr>
+    </w:sdtEndPr>
+    <w:sdtContent>
+      <w:p>
+        <w:pPr>
+          <w:pStyle w:val="Footer"/>
+          <w:framePr w:wrap="none" w:vAnchor="text" w:hAnchor="margin" w:xAlign="center" w:y="1"/>
+          <w:rPr>
+            <w:rStyle w:val="PageNumber"/>
+          </w:rPr>
+        </w:pPr>
+        <w:r>
+          <w:rPr>
+            <w:rStyle w:val="PageNumber"/>
+          </w:rPr>
+          <w:fldChar w:fldCharType="begin"/>
+        </w:r>
+        <w:r>
+          <w:rPr>
+            <w:rStyle w:val="PageNumber"/>
+          </w:rPr>
+          <w:instrText xml:space="preserve"> PAGE </w:instrText>
+        </w:r>
+        <w:r>
+          <w:rPr>
+            <w:rStyle w:val="PageNumber"/>
+          </w:rPr>
+          <w:fldChar w:fldCharType="separate"/>
+        </w:r>
+        <w:r>
+          <w:rPr>
+            <w:rStyle w:val="PageNumber"/>
+            <w:noProof/>
+          </w:rPr>
+          <w:t>1</w:t>
+        </w:r>
+        <w:r>
+          <w:rPr>
+            <w:rStyle w:val="PageNumber"/>
+          </w:rPr>
+          <w:fldChar w:fldCharType="end"/>
+        </w:r>
+      </w:p>
+    </w:sdtContent>
+  </w:sdt>
+  <w:p>
+    <w:pPr>
+      <w:pStyle w:val="Footer"/>
+    </w:pPr>
+  </w:p>
+</w:ftr>
+</file>
+
 <file path=word/footnotes.xml><?xml version="1.0" encoding="utf-8"?>
-<w:footnotes xmlns:wpc="http://schemas.microsoft.com/office/word/2010/wordprocessingCanvas" xmlns:cx="http://schemas.microsoft.com/office/drawing/2014/chartex" xmlns:cx1="http://schemas.microsoft.com/office/drawing/2015/9/8/chartex" xmlns:cx2="http://schemas.microsoft.com/office/drawing/2015/10/21/chartex" xmlns:cx3="http://schemas.microsoft.com/office/drawing/2016/5/9/chartex" xmlns:cx4="http://schemas.microsoft.com/office/drawing/2016/5/10/chartex" xmlns:cx5="http://schemas.microsoft.com/office/drawing/2016/5/11/chartex" xmlns:cx6="http://schemas.microsoft.com/office/drawing/2016/5/12/chartex" xmlns:cx7="http://schemas.microsoft.com/office/drawing/2016/5/13/chartex" xmlns:cx8="http://schemas.microsoft.com/office/drawing/2016/5/14/chartex" xmlns:mc="http://schemas.openxmlformats.org/markup-compatibility/2006" xmlns:aink="http://schemas.microsoft.com/office/drawing/2016/ink" xmlns:am3d="http://schemas.microsoft.com/office/drawing/2017/model3d" xmlns:o="urn:schemas-microsoft-com:office:office" xmlns:oel="http://schemas.microsoft.com/office/2019/extlst" xmlns:r="http://schemas.openxmlformats.org/officeDocument/2006/relationships" xmlns:m="http://schemas.openxmlformats.org/officeDocument/2006/math" xmlns:v="urn:schemas-microsoft-com:vml" xmlns:wp14="http://schemas.microsoft.com/office/word/2010/wordprocessingDrawing" xmlns:wp="http://schemas.openxmlformats.org/drawingml/2006/wordprocessingDrawing" xmlns:w10="urn:schemas-microsoft-com:office:word" xmlns:w="http://schemas.openxmlformats.org/wordprocessingml/2006/main" xmlns:w14="http://schemas.microsoft.com/office/word/2010/wordml" xmlns:w15="http://schemas.microsoft.com/office/word/2012/wordml" xmlns:w16cex="http://schemas.microsoft.com/office/word/2018/wordml/cex" xmlns:w16cid="http://schemas.microsoft.com/office/word/2016/wordml/cid" xmlns:w16="http://schemas.microsoft.com/office/word/2018/wordml" xmlns:w16du="http://schemas.microsoft.com/office/word/2023/wordml/word16du" xmlns:w16sdtdh="http://schemas.microsoft.com/office/word/2020/wordml/sdtdatahash" xmlns:w16se="http://schemas.microsoft.com/office/word/2015/wordml/symex" xmlns:wpg="http://schemas.microsoft.com/office/word/2010/wordprocessingGroup" xmlns:wpi="http://schemas.microsoft.com/office/word/2010/wordprocessingInk" xmlns:wne="http://schemas.microsoft.com/office/word/2006/wordml" xmlns:wps="http://schemas.microsoft.com/office/word/2010/wordprocessingShape" mc:Ignorable="w14 w15 w16se w16cid w16 w16cex w16sdtdh w16du wp14">
+<w:footnotes xmlns:wpc="http://schemas.microsoft.com/office/word/2010/wordprocessingCanvas" xmlns:cx="http://schemas.microsoft.com/office/drawing/2014/chartex" xmlns:cx1="http://schemas.microsoft.com/office/drawing/2015/9/8/chartex" xmlns:cx2="http://schemas.microsoft.com/office/drawing/2015/10/21/chartex" xmlns:cx3="http://schemas.microsoft.com/office/drawing/2016/5/9/chartex" xmlns:cx4="http://schemas.microsoft.com/office/drawing/2016/5/10/chartex" xmlns:cx5="http://schemas.microsoft.com/office/drawing/2016/5/11/chartex" xmlns:cx6="http://schemas.microsoft.com/office/drawing/2016/5/12/chartex" xmlns:cx7="http://schemas.microsoft.com/office/drawing/2016/5/13/chartex" xmlns:cx8="http://schemas.microsoft.com/office/drawing/2016/5/14/chartex" xmlns:mc="http://schemas.openxmlformats.org/markup-compatibility/2006" xmlns:aink="http://schemas.microsoft.com/office/drawing/2016/ink" xmlns:am3d="http://schemas.microsoft.com/office/drawing/2017/model3d" xmlns:o="urn:schemas-microsoft-com:office:office" xmlns:oel="http://schemas.microsoft.com/office/2019/extlst" xmlns:r="http://schemas.openxmlformats.org/officeDocument/2006/relationships" xmlns:m="http://schemas.openxmlformats.org/officeDocument/2006/math" xmlns:v="urn:schemas-microsoft-com:vml" xmlns:wp14="http://schemas.microsoft.com/office/word/2010/wordprocessingDrawing" xmlns:wp="http://schemas.openxmlformats.org/drawingml/2006/wordprocessingDrawing" xmlns:w10="urn:schemas-microsoft-com:office:word" xmlns:w="http://schemas.openxmlformats.org/wordprocessingml/2006/main" xmlns:w14="http://schemas.microsoft.com/office/word/2010/wordml" xmlns:w15="http://schemas.microsoft.com/office/word/2012/wordml" xmlns:w16cex="http://schemas.microsoft.com/office/word/2018/wordml/cex" xmlns:w16cid="http://schemas.microsoft.com/office/word/2016/wordml/cid" xmlns:w16="http://schemas.microsoft.com/office/word/2018/wordml" xmlns:w16du="http://schemas.microsoft.com/office/word/2023/wordml/word16du" xmlns:w16sdtdh="http://schemas.microsoft.com/office/word/2020/wordml/sdtdatahash" xmlns:w16sdtfl="http://schemas.microsoft.com/office/word/2024/wordml/sdtformatlock" xmlns:w16se="http://schemas.microsoft.com/office/word/2015/wordml/symex" xmlns:wpg="http://schemas.microsoft.com/office/word/2010/wordprocessingGroup" xmlns:wpi="http://schemas.microsoft.com/office/word/2010/wordprocessingInk" xmlns:wne="http://schemas.microsoft.com/office/word/2006/wordml" xmlns:wps="http://schemas.microsoft.com/office/word/2010/wordprocessingShape" mc:Ignorable="w14 w15 w16se w16cid w16 w16cex w16sdtdh w16sdtfl w16du wp14">
   <w:footnote w:type="separator" w:id="-1">
     <w:p>
       <w:r>
@@ -1087,7 +1643,7 @@
 </file>
 
 <file path=word/header1.xml><?xml version="1.0" encoding="utf-8"?>
-<w:hdr xmlns:wpc="http://schemas.microsoft.com/office/word/2010/wordprocessingCanvas" xmlns:cx="http://schemas.microsoft.com/office/drawing/2014/chartex" xmlns:cx1="http://schemas.microsoft.com/office/drawing/2015/9/8/chartex" xmlns:cx2="http://schemas.microsoft.com/office/drawing/2015/10/21/chartex" xmlns:cx3="http://schemas.microsoft.com/office/drawing/2016/5/9/chartex" xmlns:cx4="http://schemas.microsoft.com/office/drawing/2016/5/10/chartex" xmlns:cx5="http://schemas.microsoft.com/office/drawing/2016/5/11/chartex" xmlns:cx6="http://schemas.microsoft.com/office/drawing/2016/5/12/chartex" xmlns:cx7="http://schemas.microsoft.com/office/drawing/2016/5/13/chartex" xmlns:cx8="http://schemas.microsoft.com/office/drawing/2016/5/14/chartex" xmlns:mc="http://schemas.openxmlformats.org/markup-compatibility/2006" xmlns:aink="http://schemas.microsoft.com/office/drawing/2016/ink" xmlns:am3d="http://schemas.microsoft.com/office/drawing/2017/model3d" xmlns:o="urn:schemas-microsoft-com:office:office" xmlns:oel="http://schemas.microsoft.com/office/2019/extlst" xmlns:r="http://schemas.openxmlformats.org/officeDocument/2006/relationships" xmlns:m="http://schemas.openxmlformats.org/officeDocument/2006/math" xmlns:v="urn:schemas-microsoft-com:vml" xmlns:wp14="http://schemas.microsoft.com/office/word/2010/wordprocessingDrawing" xmlns:wp="http://schemas.openxmlformats.org/drawingml/2006/wordprocessingDrawing" xmlns:w10="urn:schemas-microsoft-com:office:word" xmlns:w="http://schemas.openxmlformats.org/wordprocessingml/2006/main" xmlns:w14="http://schemas.microsoft.com/office/word/2010/wordml" xmlns:w15="http://schemas.microsoft.com/office/word/2012/wordml" xmlns:w16cex="http://schemas.microsoft.com/office/word/2018/wordml/cex" xmlns:w16cid="http://schemas.microsoft.com/office/word/2016/wordml/cid" xmlns:w16="http://schemas.microsoft.com/office/word/2018/wordml" xmlns:w16du="http://schemas.microsoft.com/office/word/2023/wordml/word16du" xmlns:w16sdtdh="http://schemas.microsoft.com/office/word/2020/wordml/sdtdatahash" xmlns:w16se="http://schemas.microsoft.com/office/word/2015/wordml/symex" xmlns:wpg="http://schemas.microsoft.com/office/word/2010/wordprocessingGroup" xmlns:wpi="http://schemas.microsoft.com/office/word/2010/wordprocessingInk" xmlns:wne="http://schemas.microsoft.com/office/word/2006/wordml" xmlns:wps="http://schemas.microsoft.com/office/word/2010/wordprocessingShape" mc:Ignorable="w14 w15 w16se w16cid w16 w16cex w16sdtdh w16du wp14">
+<w:hdr xmlns:wpc="http://schemas.microsoft.com/office/word/2010/wordprocessingCanvas" xmlns:cx="http://schemas.microsoft.com/office/drawing/2014/chartex" xmlns:cx1="http://schemas.microsoft.com/office/drawing/2015/9/8/chartex" xmlns:cx2="http://schemas.microsoft.com/office/drawing/2015/10/21/chartex" xmlns:cx3="http://schemas.microsoft.com/office/drawing/2016/5/9/chartex" xmlns:cx4="http://schemas.microsoft.com/office/drawing/2016/5/10/chartex" xmlns:cx5="http://schemas.microsoft.com/office/drawing/2016/5/11/chartex" xmlns:cx6="http://schemas.microsoft.com/office/drawing/2016/5/12/chartex" xmlns:cx7="http://schemas.microsoft.com/office/drawing/2016/5/13/chartex" xmlns:cx8="http://schemas.microsoft.com/office/drawing/2016/5/14/chartex" xmlns:mc="http://schemas.openxmlformats.org/markup-compatibility/2006" xmlns:aink="http://schemas.microsoft.com/office/drawing/2016/ink" xmlns:am3d="http://schemas.microsoft.com/office/drawing/2017/model3d" xmlns:o="urn:schemas-microsoft-com:office:office" xmlns:oel="http://schemas.microsoft.com/office/2019/extlst" xmlns:r="http://schemas.openxmlformats.org/officeDocument/2006/relationships" xmlns:m="http://schemas.openxmlformats.org/officeDocument/2006/math" xmlns:v="urn:schemas-microsoft-com:vml" xmlns:wp14="http://schemas.microsoft.com/office/word/2010/wordprocessingDrawing" xmlns:wp="http://schemas.openxmlformats.org/drawingml/2006/wordprocessingDrawing" xmlns:w10="urn:schemas-microsoft-com:office:word" xmlns:w="http://schemas.openxmlformats.org/wordprocessingml/2006/main" xmlns:w14="http://schemas.microsoft.com/office/word/2010/wordml" xmlns:w15="http://schemas.microsoft.com/office/word/2012/wordml" xmlns:w16cex="http://schemas.microsoft.com/office/word/2018/wordml/cex" xmlns:w16cid="http://schemas.microsoft.com/office/word/2016/wordml/cid" xmlns:w16="http://schemas.microsoft.com/office/word/2018/wordml" xmlns:w16du="http://schemas.microsoft.com/office/word/2023/wordml/word16du" xmlns:w16sdtdh="http://schemas.microsoft.com/office/word/2020/wordml/sdtdatahash" xmlns:w16sdtfl="http://schemas.microsoft.com/office/word/2024/wordml/sdtformatlock" xmlns:w16se="http://schemas.microsoft.com/office/word/2015/wordml/symex" xmlns:wpg="http://schemas.microsoft.com/office/word/2010/wordprocessingGroup" xmlns:wpi="http://schemas.microsoft.com/office/word/2010/wordprocessingInk" xmlns:wne="http://schemas.microsoft.com/office/word/2006/wordml" xmlns:wps="http://schemas.microsoft.com/office/word/2010/wordprocessingShape" mc:Ignorable="w14 w15 w16se w16cid w16 w16cex w16sdtdh w16sdtfl w16du wp14">
   <w:p>
     <w:pPr>
       <w:pStyle w:val="Title"/>
@@ -1175,7 +1731,7 @@
         <w:szCs w:val="28"/>
         <w14:ligatures w14:val="none"/>
       </w:rPr>
-      <w:t>1</w:t>
+      <w:t>2</w:t>
     </w:r>
     <w:r>
       <w:rPr>
@@ -1188,18 +1744,6 @@
         <w14:ligatures w14:val="none"/>
       </w:rPr>
       <w:t>.0</w:t>
-    </w:r>
-    <w:r>
-      <w:rPr>
-        <w:rFonts w:ascii="Times New Roman" w:hAnsi="Times New Roman" w:cs="Times New Roman"/>
-        <w:b/>
-        <w:color w:val="2F5496" w:themeColor="accent1" w:themeShade="BF"/>
-        <w:spacing w:val="5"/>
-        <w:sz w:val="28"/>
-        <w:szCs w:val="28"/>
-        <w14:ligatures w14:val="none"/>
-      </w:rPr>
-      <w:tab/>
     </w:r>
     <w:r>
       <w:rPr>
@@ -1247,7 +1791,7 @@
         <w:szCs w:val="20"/>
         <w14:ligatures w14:val="none"/>
       </w:rPr>
-      <w:t xml:space="preserve">ated: </w:t>
+      <w:t>ated:</w:t>
     </w:r>
     <w:r>
       <w:rPr>
@@ -1259,26 +1803,14 @@
         <w:szCs w:val="20"/>
         <w14:ligatures w14:val="none"/>
       </w:rPr>
-      <w:t>1</w:t>
-    </w:r>
-    <w:r>
-      <w:rPr>
-        <w:rFonts w:ascii="Times New Roman" w:hAnsi="Times New Roman" w:cs="Times New Roman"/>
-        <w:bCs/>
-        <w:color w:val="2F5496" w:themeColor="accent1" w:themeShade="BF"/>
-        <w:spacing w:val="5"/>
-        <w:sz w:val="20"/>
-        <w:szCs w:val="20"/>
-        <w14:ligatures w14:val="none"/>
-      </w:rPr>
-      <w:t>1/20/24</w:t>
+      <w:t xml:space="preserve"> 2025-05-12</w:t>
     </w:r>
   </w:p>
 </w:hdr>
 </file>
 
 <file path=word/numbering.xml><?xml version="1.0" encoding="utf-8"?>
-<w:numbering xmlns:wpc="http://schemas.microsoft.com/office/word/2010/wordprocessingCanvas" xmlns:cx="http://schemas.microsoft.com/office/drawing/2014/chartex" xmlns:cx1="http://schemas.microsoft.com/office/drawing/2015/9/8/chartex" xmlns:cx2="http://schemas.microsoft.com/office/drawing/2015/10/21/chartex" xmlns:cx3="http://schemas.microsoft.com/office/drawing/2016/5/9/chartex" xmlns:cx4="http://schemas.microsoft.com/office/drawing/2016/5/10/chartex" xmlns:cx5="http://schemas.microsoft.com/office/drawing/2016/5/11/chartex" xmlns:cx6="http://schemas.microsoft.com/office/drawing/2016/5/12/chartex" xmlns:cx7="http://schemas.microsoft.com/office/drawing/2016/5/13/chartex" xmlns:cx8="http://schemas.microsoft.com/office/drawing/2016/5/14/chartex" xmlns:mc="http://schemas.openxmlformats.org/markup-compatibility/2006" xmlns:aink="http://schemas.microsoft.com/office/drawing/2016/ink" xmlns:am3d="http://schemas.microsoft.com/office/drawing/2017/model3d" xmlns:o="urn:schemas-microsoft-com:office:office" xmlns:oel="http://schemas.microsoft.com/office/2019/extlst" xmlns:r="http://schemas.openxmlformats.org/officeDocument/2006/relationships" xmlns:m="http://schemas.openxmlformats.org/officeDocument/2006/math" xmlns:v="urn:schemas-microsoft-com:vml" xmlns:wp14="http://schemas.microsoft.com/office/word/2010/wordprocessingDrawing" xmlns:wp="http://schemas.openxmlformats.org/drawingml/2006/wordprocessingDrawing" xmlns:w10="urn:schemas-microsoft-com:office:word" xmlns:w="http://schemas.openxmlformats.org/wordprocessingml/2006/main" xmlns:w14="http://schemas.microsoft.com/office/word/2010/wordml" xmlns:w15="http://schemas.microsoft.com/office/word/2012/wordml" xmlns:w16cex="http://schemas.microsoft.com/office/word/2018/wordml/cex" xmlns:w16cid="http://schemas.microsoft.com/office/word/2016/wordml/cid" xmlns:w16="http://schemas.microsoft.com/office/word/2018/wordml" xmlns:w16du="http://schemas.microsoft.com/office/word/2023/wordml/word16du" xmlns:w16sdtdh="http://schemas.microsoft.com/office/word/2020/wordml/sdtdatahash" xmlns:w16se="http://schemas.microsoft.com/office/word/2015/wordml/symex" xmlns:wpg="http://schemas.microsoft.com/office/word/2010/wordprocessingGroup" xmlns:wpi="http://schemas.microsoft.com/office/word/2010/wordprocessingInk" xmlns:wne="http://schemas.microsoft.com/office/word/2006/wordml" xmlns:wps="http://schemas.microsoft.com/office/word/2010/wordprocessingShape" mc:Ignorable="w14 w15 w16se w16cid w16 w16cex w16sdtdh w16du wp14">
+<w:numbering xmlns:wpc="http://schemas.microsoft.com/office/word/2010/wordprocessingCanvas" xmlns:cx="http://schemas.microsoft.com/office/drawing/2014/chartex" xmlns:cx1="http://schemas.microsoft.com/office/drawing/2015/9/8/chartex" xmlns:cx2="http://schemas.microsoft.com/office/drawing/2015/10/21/chartex" xmlns:cx3="http://schemas.microsoft.com/office/drawing/2016/5/9/chartex" xmlns:cx4="http://schemas.microsoft.com/office/drawing/2016/5/10/chartex" xmlns:cx5="http://schemas.microsoft.com/office/drawing/2016/5/11/chartex" xmlns:cx6="http://schemas.microsoft.com/office/drawing/2016/5/12/chartex" xmlns:cx7="http://schemas.microsoft.com/office/drawing/2016/5/13/chartex" xmlns:cx8="http://schemas.microsoft.com/office/drawing/2016/5/14/chartex" xmlns:mc="http://schemas.openxmlformats.org/markup-compatibility/2006" xmlns:aink="http://schemas.microsoft.com/office/drawing/2016/ink" xmlns:am3d="http://schemas.microsoft.com/office/drawing/2017/model3d" xmlns:o="urn:schemas-microsoft-com:office:office" xmlns:oel="http://schemas.microsoft.com/office/2019/extlst" xmlns:r="http://schemas.openxmlformats.org/officeDocument/2006/relationships" xmlns:m="http://schemas.openxmlformats.org/officeDocument/2006/math" xmlns:v="urn:schemas-microsoft-com:vml" xmlns:wp14="http://schemas.microsoft.com/office/word/2010/wordprocessingDrawing" xmlns:wp="http://schemas.openxmlformats.org/drawingml/2006/wordprocessingDrawing" xmlns:w10="urn:schemas-microsoft-com:office:word" xmlns:w="http://schemas.openxmlformats.org/wordprocessingml/2006/main" xmlns:w14="http://schemas.microsoft.com/office/word/2010/wordml" xmlns:w15="http://schemas.microsoft.com/office/word/2012/wordml" xmlns:w16cex="http://schemas.microsoft.com/office/word/2018/wordml/cex" xmlns:w16cid="http://schemas.microsoft.com/office/word/2016/wordml/cid" xmlns:w16="http://schemas.microsoft.com/office/word/2018/wordml" xmlns:w16du="http://schemas.microsoft.com/office/word/2023/wordml/word16du" xmlns:w16sdtdh="http://schemas.microsoft.com/office/word/2020/wordml/sdtdatahash" xmlns:w16sdtfl="http://schemas.microsoft.com/office/word/2024/wordml/sdtformatlock" xmlns:w16se="http://schemas.microsoft.com/office/word/2015/wordml/symex" xmlns:wpg="http://schemas.microsoft.com/office/word/2010/wordprocessingGroup" xmlns:wpi="http://schemas.microsoft.com/office/word/2010/wordprocessingInk" xmlns:wne="http://schemas.microsoft.com/office/word/2006/wordml" xmlns:wps="http://schemas.microsoft.com/office/word/2010/wordprocessingShape" mc:Ignorable="w14 w15 w16se w16cid w16 w16cex w16sdtdh w16sdtfl w16du wp14">
   <w:abstractNum w:abstractNumId="0" w15:restartNumberingAfterBreak="0">
     <w:nsid w:val="43CD42C8"/>
     <w:multiLevelType w:val="hybridMultilevel"/>
@@ -1289,7 +1821,7 @@
       <w:lvlText w:val="%1."/>
       <w:lvlJc w:val="left"/>
       <w:pPr>
-        <w:ind w:left="720" w:hanging="360"/>
+        <w:ind w:left="360" w:hanging="360"/>
       </w:pPr>
       <w:rPr>
         <w:rFonts w:hint="default"/>
@@ -1305,7 +1837,7 @@
       <w:lvlText w:val="%2."/>
       <w:lvlJc w:val="left"/>
       <w:pPr>
-        <w:ind w:left="1440" w:hanging="360"/>
+        <w:ind w:left="1080" w:hanging="360"/>
       </w:pPr>
     </w:lvl>
     <w:lvl w:ilvl="2" w:tplc="0409001B" w:tentative="1">
@@ -1314,7 +1846,7 @@
       <w:lvlText w:val="%3."/>
       <w:lvlJc w:val="right"/>
       <w:pPr>
-        <w:ind w:left="2160" w:hanging="180"/>
+        <w:ind w:left="1800" w:hanging="180"/>
       </w:pPr>
     </w:lvl>
     <w:lvl w:ilvl="3" w:tplc="0409000F" w:tentative="1">
@@ -1323,7 +1855,7 @@
       <w:lvlText w:val="%4."/>
       <w:lvlJc w:val="left"/>
       <w:pPr>
-        <w:ind w:left="2880" w:hanging="360"/>
+        <w:ind w:left="2520" w:hanging="360"/>
       </w:pPr>
     </w:lvl>
     <w:lvl w:ilvl="4" w:tplc="04090019" w:tentative="1">
@@ -1332,7 +1864,7 @@
       <w:lvlText w:val="%5."/>
       <w:lvlJc w:val="left"/>
       <w:pPr>
-        <w:ind w:left="3600" w:hanging="360"/>
+        <w:ind w:left="3240" w:hanging="360"/>
       </w:pPr>
     </w:lvl>
     <w:lvl w:ilvl="5" w:tplc="0409001B" w:tentative="1">
@@ -1341,7 +1873,7 @@
       <w:lvlText w:val="%6."/>
       <w:lvlJc w:val="right"/>
       <w:pPr>
-        <w:ind w:left="4320" w:hanging="180"/>
+        <w:ind w:left="3960" w:hanging="180"/>
       </w:pPr>
     </w:lvl>
     <w:lvl w:ilvl="6" w:tplc="0409000F" w:tentative="1">
@@ -1350,7 +1882,7 @@
       <w:lvlText w:val="%7."/>
       <w:lvlJc w:val="left"/>
       <w:pPr>
-        <w:ind w:left="5040" w:hanging="360"/>
+        <w:ind w:left="4680" w:hanging="360"/>
       </w:pPr>
     </w:lvl>
     <w:lvl w:ilvl="7" w:tplc="04090019" w:tentative="1">
@@ -1359,7 +1891,7 @@
       <w:lvlText w:val="%8."/>
       <w:lvlJc w:val="left"/>
       <w:pPr>
-        <w:ind w:left="5760" w:hanging="360"/>
+        <w:ind w:left="5400" w:hanging="360"/>
       </w:pPr>
     </w:lvl>
     <w:lvl w:ilvl="8" w:tplc="0409001B" w:tentative="1">
@@ -1368,7 +1900,7 @@
       <w:lvlText w:val="%9."/>
       <w:lvlJc w:val="right"/>
       <w:pPr>
-        <w:ind w:left="6480" w:hanging="180"/>
+        <w:ind w:left="6120" w:hanging="180"/>
       </w:pPr>
     </w:lvl>
   </w:abstractNum>
@@ -1379,7 +1911,7 @@
 </file>
 
 <file path=word/styles.xml><?xml version="1.0" encoding="utf-8"?>
-<w:styles xmlns:mc="http://schemas.openxmlformats.org/markup-compatibility/2006" xmlns:r="http://schemas.openxmlformats.org/officeDocument/2006/relationships" xmlns:w="http://schemas.openxmlformats.org/wordprocessingml/2006/main" xmlns:w14="http://schemas.microsoft.com/office/word/2010/wordml" xmlns:w15="http://schemas.microsoft.com/office/word/2012/wordml" xmlns:w16cex="http://schemas.microsoft.com/office/word/2018/wordml/cex" xmlns:w16cid="http://schemas.microsoft.com/office/word/2016/wordml/cid" xmlns:w16="http://schemas.microsoft.com/office/word/2018/wordml" xmlns:w16du="http://schemas.microsoft.com/office/word/2023/wordml/word16du" xmlns:w16sdtdh="http://schemas.microsoft.com/office/word/2020/wordml/sdtdatahash" xmlns:w16se="http://schemas.microsoft.com/office/word/2015/wordml/symex" mc:Ignorable="w14 w15 w16se w16cid w16 w16cex w16sdtdh w16du">
+<w:styles xmlns:mc="http://schemas.openxmlformats.org/markup-compatibility/2006" xmlns:r="http://schemas.openxmlformats.org/officeDocument/2006/relationships" xmlns:w="http://schemas.openxmlformats.org/wordprocessingml/2006/main" xmlns:w14="http://schemas.microsoft.com/office/word/2010/wordml" xmlns:w15="http://schemas.microsoft.com/office/word/2012/wordml" xmlns:w16cex="http://schemas.microsoft.com/office/word/2018/wordml/cex" xmlns:w16cid="http://schemas.microsoft.com/office/word/2016/wordml/cid" xmlns:w16="http://schemas.microsoft.com/office/word/2018/wordml" xmlns:w16du="http://schemas.microsoft.com/office/word/2023/wordml/word16du" xmlns:w16sdtdh="http://schemas.microsoft.com/office/word/2020/wordml/sdtdatahash" xmlns:w16sdtfl="http://schemas.microsoft.com/office/word/2024/wordml/sdtformatlock" xmlns:w16se="http://schemas.microsoft.com/office/word/2015/wordml/symex" mc:Ignorable="w14 w15 w16se w16cid w16 w16cex w16sdtdh w16sdtfl w16du">
   <w:docDefaults>
     <w:rPrDefault>
       <w:rPr>
@@ -1931,6 +2463,14 @@
     <w:semiHidden/>
     <w:rsid w:val="0043720D"/>
   </w:style>
+  <w:style w:type="character" w:styleId="PageNumber">
+    <w:name w:val="page number"/>
+    <w:basedOn w:val="DefaultParagraphFont"/>
+    <w:uiPriority w:val="99"/>
+    <w:semiHidden/>
+    <w:unhideWhenUsed/>
+    <w:rsid w:val="00AE21D5"/>
+  </w:style>
 </w:styles>
 </file>
 

</xml_diff>